<commit_message>
phase 7: final verification, clean seed, and test suite hardening
</commit_message>
<xml_diff>
--- a/docs/evidence/w4b_sponsorship_request_letter.docx
+++ b/docs/evidence/w4b_sponsorship_request_letter.docx
@@ -158,12 +158,13 @@
           <w:p>
             <w:pPr>
               <w:keepNext/>
-              <w:spacing w:before="0" w:after="0"/>
+              <w:spacing w:before="0" w:after="40"/>
             </w:pPr>
             <w:r>
               <w:rPr>
                 <w:rFonts w:ascii="Times New Roman" w:hAnsi="Times New Roman"/>
                 <w:b/>
+                <w:i w:val="0"/>
                 <w:sz w:val="20"/>
               </w:rPr>
               <w:t>Organizing Body</w:t>
@@ -188,11 +189,13 @@
           </w:tcPr>
           <w:p>
             <w:pPr>
-              <w:spacing w:before="0" w:after="0"/>
+              <w:spacing w:before="0" w:after="40"/>
             </w:pPr>
             <w:r>
               <w:rPr>
                 <w:rFonts w:ascii="Times New Roman" w:hAnsi="Times New Roman"/>
+                <w:b w:val="0"/>
+                <w:i w:val="0"/>
                 <w:sz w:val="20"/>
               </w:rPr>
               <w:t>ACM Student Chapter &amp; Coding Club, SVNIT</w:t>
@@ -224,12 +227,13 @@
           <w:p>
             <w:pPr>
               <w:keepNext/>
-              <w:spacing w:before="0" w:after="0"/>
+              <w:spacing w:before="0" w:after="40"/>
             </w:pPr>
             <w:r>
               <w:rPr>
                 <w:rFonts w:ascii="Times New Roman" w:hAnsi="Times New Roman"/>
                 <w:b/>
+                <w:i w:val="0"/>
                 <w:sz w:val="20"/>
               </w:rPr>
               <w:t>Flagship Event</w:t>
@@ -254,7 +258,7 @@
           </w:tcPr>
           <w:p>
             <w:pPr>
-              <w:spacing w:before="0" w:after="0"/>
+              <w:spacing w:before="0" w:after="40"/>
             </w:pPr>
             <w:r>
               <w:rPr>
@@ -290,12 +294,13 @@
           <w:p>
             <w:pPr>
               <w:keepNext/>
-              <w:spacing w:before="0" w:after="0"/>
+              <w:spacing w:before="0" w:after="40"/>
             </w:pPr>
             <w:r>
               <w:rPr>
                 <w:rFonts w:ascii="Times New Roman" w:hAnsi="Times New Roman"/>
                 <w:b/>
+                <w:i w:val="0"/>
                 <w:sz w:val="20"/>
               </w:rPr>
               <w:t>Confirmed Date</w:t>
@@ -320,7 +325,7 @@
           </w:tcPr>
           <w:p>
             <w:pPr>
-              <w:spacing w:before="0" w:after="0"/>
+              <w:spacing w:before="0" w:after="40"/>
             </w:pPr>
             <w:r>
               <w:rPr>
@@ -356,12 +361,13 @@
           <w:p>
             <w:pPr>
               <w:keepNext/>
-              <w:spacing w:before="0" w:after="0"/>
+              <w:spacing w:before="0" w:after="40"/>
             </w:pPr>
             <w:r>
               <w:rPr>
                 <w:rFonts w:ascii="Times New Roman" w:hAnsi="Times New Roman"/>
                 <w:b/>
+                <w:i w:val="0"/>
                 <w:sz w:val="20"/>
               </w:rPr>
               <w:t>Campus Venue</w:t>
@@ -386,7 +392,7 @@
           </w:tcPr>
           <w:p>
             <w:pPr>
-              <w:spacing w:before="0" w:after="0"/>
+              <w:spacing w:before="0" w:after="40"/>
             </w:pPr>
             <w:r>
               <w:rPr>
@@ -456,13 +462,13 @@
           </w:tcPr>
           <w:p>
             <w:pPr>
-              <w:spacing w:before="0" w:after="0"/>
-              <w:jc w:val="left"/>
+              <w:spacing w:before="0" w:after="40"/>
             </w:pPr>
             <w:r>
               <w:rPr>
                 <w:rFonts w:ascii="Times New Roman" w:hAnsi="Times New Roman"/>
                 <w:b/>
+                <w:i w:val="0"/>
                 <w:color w:val="1E5B94"/>
                 <w:sz w:val="20"/>
               </w:rPr>
@@ -489,13 +495,13 @@
           </w:tcPr>
           <w:p>
             <w:pPr>
-              <w:spacing w:before="0" w:after="0"/>
-              <w:jc w:val="center"/>
+              <w:spacing w:before="0" w:after="40"/>
             </w:pPr>
             <w:r>
               <w:rPr>
                 <w:rFonts w:ascii="Times New Roman" w:hAnsi="Times New Roman"/>
                 <w:b/>
+                <w:i w:val="0"/>
                 <w:color w:val="1E5B94"/>
                 <w:sz w:val="20"/>
               </w:rPr>
@@ -522,13 +528,13 @@
           </w:tcPr>
           <w:p>
             <w:pPr>
-              <w:spacing w:before="0" w:after="0"/>
-              <w:jc w:val="right"/>
+              <w:spacing w:before="0" w:after="40"/>
             </w:pPr>
             <w:r>
               <w:rPr>
                 <w:rFonts w:ascii="Times New Roman" w:hAnsi="Times New Roman"/>
                 <w:b/>
+                <w:i w:val="0"/>
                 <w:color w:val="1E5B94"/>
                 <w:sz w:val="20"/>
               </w:rPr>
@@ -559,8 +565,7 @@
           </w:tcPr>
           <w:p>
             <w:pPr>
-              <w:spacing w:before="0" w:after="0"/>
-              <w:jc w:val="left"/>
+              <w:spacing w:before="0" w:after="40"/>
             </w:pPr>
             <w:r>
               <w:rPr>
@@ -589,8 +594,7 @@
           </w:tcPr>
           <w:p>
             <w:pPr>
-              <w:spacing w:before="0" w:after="0"/>
-              <w:jc w:val="center"/>
+              <w:spacing w:before="0" w:after="40"/>
             </w:pPr>
             <w:r>
               <w:rPr>
@@ -619,8 +623,7 @@
           </w:tcPr>
           <w:p>
             <w:pPr>
-              <w:spacing w:before="0" w:after="0"/>
-              <w:jc w:val="right"/>
+              <w:spacing w:before="0" w:after="40"/>
             </w:pPr>
             <w:r>
               <w:rPr>
@@ -654,8 +657,7 @@
           </w:tcPr>
           <w:p>
             <w:pPr>
-              <w:spacing w:before="0" w:after="0"/>
-              <w:jc w:val="left"/>
+              <w:spacing w:before="0" w:after="40"/>
             </w:pPr>
             <w:r>
               <w:rPr>
@@ -684,8 +686,7 @@
           </w:tcPr>
           <w:p>
             <w:pPr>
-              <w:spacing w:before="0" w:after="0"/>
-              <w:jc w:val="center"/>
+              <w:spacing w:before="0" w:after="40"/>
             </w:pPr>
             <w:r>
               <w:rPr>
@@ -714,8 +715,7 @@
           </w:tcPr>
           <w:p>
             <w:pPr>
-              <w:spacing w:before="0" w:after="0"/>
-              <w:jc w:val="right"/>
+              <w:spacing w:before="0" w:after="40"/>
             </w:pPr>
             <w:r>
               <w:rPr>
@@ -913,25 +913,29 @@
           <w:p>
             <w:pPr>
               <w:keepNext/>
-              <w:spacing w:before="60" w:after="200"/>
+              <w:spacing w:before="0" w:after="40"/>
               <w:jc w:val="center"/>
             </w:pPr>
             <w:r>
               <w:rPr>
                 <w:rFonts w:ascii="Times New Roman" w:hAnsi="Times New Roman"/>
                 <w:b/>
-                <w:sz w:val="19"/>
+                <w:i w:val="0"/>
+                <w:sz w:val="20"/>
               </w:rPr>
               <w:t>Student Coordinator</w:t>
             </w:r>
-            <w:r>
-              <w:br/>
-            </w:r>
+          </w:p>
+          <w:p>
+            <w:pPr>
+              <w:spacing w:before="0" w:after="40"/>
+            </w:pPr>
             <w:r>
               <w:rPr>
                 <w:rFonts w:ascii="Times New Roman" w:hAnsi="Times New Roman"/>
-                <w:color w:val="4B5563"/>
-                <w:sz w:val="17"/>
+                <w:b/>
+                <w:i w:val="0"/>
+                <w:sz w:val="20"/>
               </w:rPr>
               <w:t>ACM Student Chapter</w:t>
             </w:r>
@@ -950,25 +954,29 @@
           <w:p>
             <w:pPr>
               <w:keepNext/>
-              <w:spacing w:before="60" w:after="200"/>
+              <w:spacing w:before="0" w:after="40"/>
               <w:jc w:val="center"/>
             </w:pPr>
             <w:r>
               <w:rPr>
                 <w:rFonts w:ascii="Times New Roman" w:hAnsi="Times New Roman"/>
                 <w:b/>
-                <w:sz w:val="19"/>
+                <w:i w:val="0"/>
+                <w:sz w:val="20"/>
               </w:rPr>
               <w:t>Faculty Advisor</w:t>
             </w:r>
-            <w:r>
-              <w:br/>
-            </w:r>
+          </w:p>
+          <w:p>
+            <w:pPr>
+              <w:spacing w:before="0" w:after="40"/>
+            </w:pPr>
             <w:r>
               <w:rPr>
                 <w:rFonts w:ascii="Times New Roman" w:hAnsi="Times New Roman"/>
-                <w:color w:val="4B5563"/>
-                <w:sz w:val="17"/>
+                <w:b/>
+                <w:i w:val="0"/>
+                <w:sz w:val="20"/>
               </w:rPr>
               <w:t>Department of CSE, SVNIT</w:t>
             </w:r>

</xml_diff>

<commit_message>
feat(studio): part 6 - quality, performance, docs refresh and clean-up
</commit_message>
<xml_diff>
--- a/docs/evidence/w4b_sponsorship_request_letter.docx
+++ b/docs/evidence/w4b_sponsorship_request_letter.docx
@@ -23,7 +23,7 @@
       </w:pPr>
       <w:r>
         <w:rPr>
-          <w:rFonts w:ascii="Times New Roman" w:hAnsi="Times New Roman"/>
+          <w:rFonts w:ascii="Times New Roman" w:hAnsi="Times New Roman" w:cs="Times New Roman"/>
           <w:b/>
           <w:i w:val="0"/>
           <w:color w:val="1E5B94"/>
@@ -40,7 +40,7 @@
       </w:pPr>
       <w:r>
         <w:rPr>
-          <w:rFonts w:ascii="Times New Roman" w:hAnsi="Times New Roman"/>
+          <w:rFonts w:ascii="Times New Roman" w:hAnsi="Times New Roman" w:cs="Times New Roman"/>
           <w:b w:val="0"/>
           <w:i w:val="0"/>
           <w:sz w:val="22"/>
@@ -60,7 +60,7 @@
       </w:pPr>
       <w:r>
         <w:rPr>
-          <w:rFonts w:ascii="Times New Roman" w:hAnsi="Times New Roman"/>
+          <w:rFonts w:ascii="Times New Roman" w:hAnsi="Times New Roman" w:cs="Times New Roman"/>
           <w:b w:val="0"/>
           <w:i w:val="0"/>
           <w:sz w:val="22"/>
@@ -70,7 +70,7 @@
       </w:r>
       <w:r>
         <w:rPr>
-          <w:rFonts w:ascii="Times New Roman" w:hAnsi="Times New Roman"/>
+          <w:rFonts w:ascii="Times New Roman" w:hAnsi="Times New Roman" w:cs="Times New Roman"/>
           <w:b w:val="0"/>
           <w:sz w:val="22"/>
         </w:rPr>
@@ -78,7 +78,7 @@
       </w:r>
       <w:r>
         <w:rPr>
-          <w:rFonts w:ascii="Times New Roman" w:hAnsi="Times New Roman"/>
+          <w:rFonts w:ascii="Times New Roman" w:hAnsi="Times New Roman" w:cs="Times New Roman"/>
           <w:b w:val="0"/>
           <w:i w:val="0"/>
           <w:sz w:val="22"/>
@@ -88,7 +88,7 @@
       </w:r>
       <w:r>
         <w:rPr>
-          <w:rFonts w:ascii="Times New Roman" w:hAnsi="Times New Roman"/>
+          <w:rFonts w:ascii="Times New Roman" w:hAnsi="Times New Roman" w:cs="Times New Roman"/>
           <w:b w:val="0"/>
           <w:sz w:val="22"/>
         </w:rPr>
@@ -96,7 +96,7 @@
       </w:r>
       <w:r>
         <w:rPr>
-          <w:rFonts w:ascii="Times New Roman" w:hAnsi="Times New Roman"/>
+          <w:rFonts w:ascii="Times New Roman" w:hAnsi="Times New Roman" w:cs="Times New Roman"/>
           <w:b w:val="0"/>
           <w:i w:val="0"/>
           <w:sz w:val="22"/>
@@ -106,7 +106,7 @@
       </w:r>
       <w:r>
         <w:rPr>
-          <w:rFonts w:ascii="Times New Roman" w:hAnsi="Times New Roman"/>
+          <w:rFonts w:ascii="Times New Roman" w:hAnsi="Times New Roman" w:cs="Times New Roman"/>
           <w:b w:val="0"/>
           <w:sz w:val="22"/>
         </w:rPr>
@@ -114,7 +114,7 @@
       </w:r>
       <w:r>
         <w:rPr>
-          <w:rFonts w:ascii="Times New Roman" w:hAnsi="Times New Roman"/>
+          <w:rFonts w:ascii="Times New Roman" w:hAnsi="Times New Roman" w:cs="Times New Roman"/>
           <w:b w:val="0"/>
           <w:i w:val="0"/>
           <w:sz w:val="22"/>
@@ -162,7 +162,7 @@
             </w:pPr>
             <w:r>
               <w:rPr>
-                <w:rFonts w:ascii="Times New Roman" w:hAnsi="Times New Roman"/>
+                <w:rFonts w:ascii="Times New Roman" w:hAnsi="Times New Roman" w:cs="Times New Roman"/>
                 <w:b/>
                 <w:i w:val="0"/>
                 <w:sz w:val="20"/>
@@ -193,7 +193,7 @@
             </w:pPr>
             <w:r>
               <w:rPr>
-                <w:rFonts w:ascii="Times New Roman" w:hAnsi="Times New Roman"/>
+                <w:rFonts w:ascii="Times New Roman" w:hAnsi="Times New Roman" w:cs="Times New Roman"/>
                 <w:b w:val="0"/>
                 <w:i w:val="0"/>
                 <w:sz w:val="20"/>
@@ -231,7 +231,7 @@
             </w:pPr>
             <w:r>
               <w:rPr>
-                <w:rFonts w:ascii="Times New Roman" w:hAnsi="Times New Roman"/>
+                <w:rFonts w:ascii="Times New Roman" w:hAnsi="Times New Roman" w:cs="Times New Roman"/>
                 <w:b/>
                 <w:i w:val="0"/>
                 <w:sz w:val="20"/>
@@ -262,7 +262,7 @@
             </w:pPr>
             <w:r>
               <w:rPr>
-                <w:rFonts w:ascii="Times New Roman" w:hAnsi="Times New Roman"/>
+                <w:rFonts w:ascii="Times New Roman" w:hAnsi="Times New Roman" w:cs="Times New Roman"/>
                 <w:sz w:val="20"/>
               </w:rPr>
               <w:t xml:space="preserve">Innovate &amp; Build Hackathon 2026</w:t>
@@ -298,7 +298,7 @@
             </w:pPr>
             <w:r>
               <w:rPr>
-                <w:rFonts w:ascii="Times New Roman" w:hAnsi="Times New Roman"/>
+                <w:rFonts w:ascii="Times New Roman" w:hAnsi="Times New Roman" w:cs="Times New Roman"/>
                 <w:b/>
                 <w:i w:val="0"/>
                 <w:sz w:val="20"/>
@@ -329,7 +329,7 @@
             </w:pPr>
             <w:r>
               <w:rPr>
-                <w:rFonts w:ascii="Times New Roman" w:hAnsi="Times New Roman"/>
+                <w:rFonts w:ascii="Times New Roman" w:hAnsi="Times New Roman" w:cs="Times New Roman"/>
                 <w:sz w:val="20"/>
               </w:rPr>
               <w:t xml:space="preserve">20/11/2026</w:t>
@@ -365,7 +365,7 @@
             </w:pPr>
             <w:r>
               <w:rPr>
-                <w:rFonts w:ascii="Times New Roman" w:hAnsi="Times New Roman"/>
+                <w:rFonts w:ascii="Times New Roman" w:hAnsi="Times New Roman" w:cs="Times New Roman"/>
                 <w:b/>
                 <w:i w:val="0"/>
                 <w:sz w:val="20"/>
@@ -396,7 +396,7 @@
             </w:pPr>
             <w:r>
               <w:rPr>
-                <w:rFonts w:ascii="Times New Roman" w:hAnsi="Times New Roman"/>
+                <w:rFonts w:ascii="Times New Roman" w:hAnsi="Times New Roman" w:cs="Times New Roman"/>
                 <w:sz w:val="20"/>
               </w:rPr>
               <w:t xml:space="preserve">New CSE Seminar Hall &amp; Advanced Lab 3</w:t>
@@ -417,7 +417,7 @@
       </w:pPr>
       <w:r>
         <w:rPr>
-          <w:rFonts w:ascii="Times New Roman" w:hAnsi="Times New Roman"/>
+          <w:rFonts w:ascii="Times New Roman" w:hAnsi="Times New Roman" w:cs="Times New Roman"/>
           <w:b w:val="0"/>
           <w:i w:val="0"/>
           <w:sz w:val="22"/>
@@ -466,7 +466,7 @@
             </w:pPr>
             <w:r>
               <w:rPr>
-                <w:rFonts w:ascii="Times New Roman" w:hAnsi="Times New Roman"/>
+                <w:rFonts w:ascii="Times New Roman" w:hAnsi="Times New Roman" w:cs="Times New Roman"/>
                 <w:b/>
                 <w:i w:val="0"/>
                 <w:color w:val="1E5B94"/>
@@ -499,7 +499,7 @@
             </w:pPr>
             <w:r>
               <w:rPr>
-                <w:rFonts w:ascii="Times New Roman" w:hAnsi="Times New Roman"/>
+                <w:rFonts w:ascii="Times New Roman" w:hAnsi="Times New Roman" w:cs="Times New Roman"/>
                 <w:b/>
                 <w:i w:val="0"/>
                 <w:color w:val="1E5B94"/>
@@ -532,7 +532,7 @@
             </w:pPr>
             <w:r>
               <w:rPr>
-                <w:rFonts w:ascii="Times New Roman" w:hAnsi="Times New Roman"/>
+                <w:rFonts w:ascii="Times New Roman" w:hAnsi="Times New Roman" w:cs="Times New Roman"/>
                 <w:b/>
                 <w:i w:val="0"/>
                 <w:color w:val="1E5B94"/>
@@ -569,7 +569,7 @@
             </w:pPr>
             <w:r>
               <w:rPr>
-                <w:rFonts w:ascii="Times New Roman" w:hAnsi="Times New Roman"/>
+                <w:rFonts w:ascii="Times New Roman" w:hAnsi="Times New Roman" w:cs="Times New Roman"/>
                 <w:sz w:val="20"/>
               </w:rPr>
               <w:t xml:space="preserve">Title Sponsor &amp; Industry Partner</w:t>
@@ -598,7 +598,7 @@
             </w:pPr>
             <w:r>
               <w:rPr>
-                <w:rFonts w:ascii="Times New Roman" w:hAnsi="Times New Roman"/>
+                <w:rFonts w:ascii="Times New Roman" w:hAnsi="Times New Roman" w:cs="Times New Roman"/>
                 <w:sz w:val="20"/>
               </w:rPr>
               <w:t xml:space="preserve">1</w:t>
@@ -627,7 +627,7 @@
             </w:pPr>
             <w:r>
               <w:rPr>
-                <w:rFonts w:ascii="Times New Roman" w:hAnsi="Times New Roman"/>
+                <w:rFonts w:ascii="Times New Roman" w:hAnsi="Times New Roman" w:cs="Times New Roman"/>
                 <w:sz w:val="20"/>
               </w:rPr>
               <w:t xml:space="preserve">50,000.00</w:t>
@@ -661,7 +661,7 @@
             </w:pPr>
             <w:r>
               <w:rPr>
-                <w:rFonts w:ascii="Times New Roman" w:hAnsi="Times New Roman"/>
+                <w:rFonts w:ascii="Times New Roman" w:hAnsi="Times New Roman" w:cs="Times New Roman"/>
                 <w:sz w:val="20"/>
               </w:rPr>
               <w:t xml:space="preserve">Gold Associate &amp; Keynote Host</w:t>
@@ -690,7 +690,7 @@
             </w:pPr>
             <w:r>
               <w:rPr>
-                <w:rFonts w:ascii="Times New Roman" w:hAnsi="Times New Roman"/>
+                <w:rFonts w:ascii="Times New Roman" w:hAnsi="Times New Roman" w:cs="Times New Roman"/>
                 <w:sz w:val="20"/>
               </w:rPr>
               <w:t xml:space="preserve">2</w:t>
@@ -719,7 +719,7 @@
             </w:pPr>
             <w:r>
               <w:rPr>
-                <w:rFonts w:ascii="Times New Roman" w:hAnsi="Times New Roman"/>
+                <w:rFonts w:ascii="Times New Roman" w:hAnsi="Times New Roman" w:cs="Times New Roman"/>
                 <w:sz w:val="20"/>
               </w:rPr>
               <w:t xml:space="preserve">25,000.00</w:t>
@@ -831,7 +831,7 @@
       </w:pPr>
       <w:r>
         <w:rPr>
-          <w:rFonts w:ascii="Times New Roman" w:hAnsi="Times New Roman"/>
+          <w:rFonts w:ascii="Times New Roman" w:hAnsi="Times New Roman" w:cs="Times New Roman"/>
           <w:b w:val="0"/>
           <w:i w:val="0"/>
           <w:sz w:val="22"/>
@@ -918,7 +918,7 @@
             </w:pPr>
             <w:r>
               <w:rPr>
-                <w:rFonts w:ascii="Times New Roman" w:hAnsi="Times New Roman"/>
+                <w:rFonts w:ascii="Times New Roman" w:hAnsi="Times New Roman" w:cs="Times New Roman"/>
                 <w:b/>
                 <w:i w:val="0"/>
                 <w:sz w:val="20"/>
@@ -932,7 +932,7 @@
             </w:pPr>
             <w:r>
               <w:rPr>
-                <w:rFonts w:ascii="Times New Roman" w:hAnsi="Times New Roman"/>
+                <w:rFonts w:ascii="Times New Roman" w:hAnsi="Times New Roman" w:cs="Times New Roman"/>
                 <w:b/>
                 <w:i w:val="0"/>
                 <w:sz w:val="20"/>
@@ -959,7 +959,7 @@
             </w:pPr>
             <w:r>
               <w:rPr>
-                <w:rFonts w:ascii="Times New Roman" w:hAnsi="Times New Roman"/>
+                <w:rFonts w:ascii="Times New Roman" w:hAnsi="Times New Roman" w:cs="Times New Roman"/>
                 <w:b/>
                 <w:i w:val="0"/>
                 <w:sz w:val="20"/>
@@ -973,7 +973,7 @@
             </w:pPr>
             <w:r>
               <w:rPr>
-                <w:rFonts w:ascii="Times New Roman" w:hAnsi="Times New Roman"/>
+                <w:rFonts w:ascii="Times New Roman" w:hAnsi="Times New Roman" w:cs="Times New Roman"/>
                 <w:b/>
                 <w:i w:val="0"/>
                 <w:sz w:val="20"/>

</xml_diff>